<commit_message>
BDOI inputs v1.1 rebuilt on the broker-only platform: tax worksheets VAT and EWT only, premium-levy returns left to the insurers, data gaps de-duplicated, guide load order with short routes
</commit_message>
<xml_diff>
--- a/docs/deliverables/out/Programme/BDOI_Inputs/BIBS_Templates_BRD-00_Master_Data_Upload_Guide_v1.1.docx
+++ b/docs/deliverables/out/Programme/BDOI_Inputs/BIBS_Templates_BRD-00_Master_Data_Upload_Guide_v1.1.docx
@@ -2118,7 +2118,7 @@
           <w:t xml:space="preserve">	</w:t>
         </w:r>
         <w:r>
-          <w:t xml:space="preserve">8</w:t>
+          <w:t xml:space="preserve">7</w:t>
         </w:r>
       </w:hyperlink>
     </w:p>
@@ -2134,7 +2134,7 @@
           <w:t xml:space="preserve">	</w:t>
         </w:r>
         <w:r>
-          <w:t xml:space="preserve">13</w:t>
+          <w:t xml:space="preserve">10</w:t>
         </w:r>
       </w:hyperlink>
     </w:p>
@@ -2150,7 +2150,7 @@
           <w:t xml:space="preserve">	</w:t>
         </w:r>
         <w:r>
-          <w:t xml:space="preserve">14</w:t>
+          <w:t xml:space="preserve">10</w:t>
         </w:r>
       </w:hyperlink>
     </w:p>
@@ -2166,7 +2166,7 @@
           <w:t xml:space="preserve">	</w:t>
         </w:r>
         <w:r>
-          <w:t xml:space="preserve">14</w:t>
+          <w:t xml:space="preserve">11</w:t>
         </w:r>
       </w:hyperlink>
     </w:p>
@@ -2182,7 +2182,7 @@
           <w:t xml:space="preserve">	</w:t>
         </w:r>
         <w:r>
-          <w:t xml:space="preserve">16</w:t>
+          <w:t xml:space="preserve">12</w:t>
         </w:r>
       </w:hyperlink>
       <w:r>
@@ -4242,1038 +4242,8 @@
       </w:r>
       <w:r>
         <w:rPr/>
-        <w:t xml:space="preserve"> states the rule BIBS applies to each charge, for BDOI to confirm.</w:t>
+        <w:t xml:space="preserve"> states the rule BIBS applies to each charge, for BDOI to confirm: every charge is a rate of the net premium after the minimum premium, computed independently of the others; DST is rounded up to the next half peso and the other charges to centavos. Charges other than these taxes (CTPL COCAF or LTO authentication, notarial or documentation fees) have no field in BIBS and are asked as questions.</w:t>
       </w:r>
-    </w:p>
-    <w:p>
-      <w:pPr>
-        <w:pStyle w:val="Caption"/>
-        <w:keepNext/>
-        <w:spacing w:after="60"/>
-      </w:pPr>
-      <w:r>
-        <w:rPr>
-          <w:b/>
-          <w:i w:val="0"/>
-        </w:rPr>
-        <w:t xml:space="preserve">Table 2: </w:t>
-      </w:r>
-      <w:r>
-        <w:rPr/>
-        <w:t>Premium charges billed to clients</w:t>
-      </w:r>
-    </w:p>
-    <w:tbl>
-      <w:tblPr>
-        <w:tblW w:type="dxa" w:w="9973"/>
-        <w:jc w:val="center"/>
-        <w:tblLook w:firstColumn="1" w:firstRow="1" w:lastColumn="0" w:lastRow="0" w:noHBand="0" w:noVBand="1" w:val="04A0"/>
-        <w:tblBorders>
-          <w:top w:val="single" w:sz="4" w:space="0" w:color="C2C2C1"/>
-          <w:left w:val="single" w:sz="4" w:space="0" w:color="C2C2C1"/>
-          <w:bottom w:val="single" w:sz="4" w:space="0" w:color="C2C2C1"/>
-          <w:right w:val="single" w:sz="4" w:space="0" w:color="C2C2C1"/>
-          <w:insideH w:val="single" w:sz="4" w:space="0" w:color="C2C2C1"/>
-          <w:insideV w:val="single" w:sz="4" w:space="0" w:color="C2C2C1"/>
-        </w:tblBorders>
-        <w:tblLayout w:type="fixed"/>
-      </w:tblPr>
-      <w:tblGrid>
-        <w:gridCol w:w="2039"/>
-        <w:gridCol w:w="5099"/>
-        <w:gridCol w:w="2833"/>
-      </w:tblGrid>
-      <w:tr>
-        <w:trPr>
-          <w:tblHeader w:val="true"/>
-          <w:cantSplit w:val="true"/>
-        </w:trPr>
-        <w:tc>
-          <w:tcPr>
-            <w:tcW w:type="dxa" w:w="2040"/>
-            <w:shd w:val="clear" w:color="auto" w:fill="004EA8"/>
-            <w:tcMar>
-              <w:top w:w="50" w:type="dxa"/>
-              <w:bottom w:w="50" w:type="dxa"/>
-              <w:left w:w="90" w:type="dxa"/>
-              <w:right w:w="90" w:type="dxa"/>
-            </w:tcMar>
-            <w:vAlign w:val="center"/>
-          </w:tcPr>
-          <w:p>
-            <w:pPr>
-              <w:pStyle w:val="BDOITableHeader"/>
-            </w:pPr>
-            <w:r>
-              <w:rPr>
-                <w:b/>
-                <w:color w:val="FFFFFF"/>
-                <w:sz w:val="16"/>
-              </w:rPr>
-              <w:t>Charge</w:t>
-            </w:r>
-          </w:p>
-        </w:tc>
-        <w:tc>
-          <w:tcPr>
-            <w:tcW w:type="dxa" w:w="5099"/>
-            <w:shd w:val="clear" w:color="auto" w:fill="004EA8"/>
-            <w:tcMar>
-              <w:top w:w="50" w:type="dxa"/>
-              <w:bottom w:w="50" w:type="dxa"/>
-              <w:left w:w="90" w:type="dxa"/>
-              <w:right w:w="90" w:type="dxa"/>
-            </w:tcMar>
-            <w:vAlign w:val="center"/>
-          </w:tcPr>
-          <w:p>
-            <w:pPr>
-              <w:pStyle w:val="BDOITableHeader"/>
-            </w:pPr>
-            <w:r>
-              <w:rPr>
-                <w:b/>
-                <w:color w:val="FFFFFF"/>
-                <w:sz w:val="16"/>
-              </w:rPr>
-              <w:t>What BIBS does</w:t>
-            </w:r>
-          </w:p>
-        </w:tc>
-        <w:tc>
-          <w:tcPr>
-            <w:tcW w:type="dxa" w:w="2833"/>
-            <w:shd w:val="clear" w:color="auto" w:fill="004EA8"/>
-            <w:tcMar>
-              <w:top w:w="50" w:type="dxa"/>
-              <w:bottom w:w="50" w:type="dxa"/>
-              <w:left w:w="90" w:type="dxa"/>
-              <w:right w:w="90" w:type="dxa"/>
-            </w:tcMar>
-            <w:vAlign w:val="center"/>
-          </w:tcPr>
-          <w:p>
-            <w:pPr>
-              <w:pStyle w:val="BDOITableHeader"/>
-            </w:pPr>
-            <w:r>
-              <w:rPr>
-                <w:b/>
-                <w:color w:val="FFFFFF"/>
-                <w:sz w:val="16"/>
-              </w:rPr>
-              <w:t>Where it is set up</w:t>
-            </w:r>
-          </w:p>
-        </w:tc>
-      </w:tr>
-      <w:tr>
-        <w:tc>
-          <w:tcPr>
-            <w:tcW w:type="dxa" w:w="2040"/>
-            <w:tcMar>
-              <w:top w:w="50" w:type="dxa"/>
-              <w:bottom w:w="50" w:type="dxa"/>
-              <w:left w:w="90" w:type="dxa"/>
-              <w:right w:w="90" w:type="dxa"/>
-            </w:tcMar>
-          </w:tcPr>
-          <w:p>
-            <w:pPr>
-              <w:pStyle w:val="BDOITable"/>
-            </w:pPr>
-            <w:r>
-              <w:rPr>
-                <w:sz w:val="16"/>
-              </w:rPr>
-              <w:t>Documentary stamp tax (DST)</w:t>
-            </w:r>
-          </w:p>
-        </w:tc>
-        <w:tc>
-          <w:tcPr>
-            <w:tcW w:type="dxa" w:w="5099"/>
-            <w:tcMar>
-              <w:top w:w="50" w:type="dxa"/>
-              <w:bottom w:w="50" w:type="dxa"/>
-              <w:left w:w="90" w:type="dxa"/>
-              <w:right w:w="90" w:type="dxa"/>
-            </w:tcMar>
-          </w:tcPr>
-          <w:p>
-            <w:pPr>
-              <w:pStyle w:val="BDOITable"/>
-            </w:pPr>
-            <w:r>
-              <w:rPr>
-                <w:sz w:val="16"/>
-              </w:rPr>
-              <w:t>Rate % of the net (basic) premium of the line. The tax is rounded to centavos and then up to the next half peso: .01 to .49 becomes .50, .51 to .99 the next peso, .00 and .50 stay; a refund is rounded the same way.</w:t>
-            </w:r>
-          </w:p>
-        </w:tc>
-        <w:tc>
-          <w:tcPr>
-            <w:tcW w:type="dxa" w:w="2833"/>
-            <w:tcMar>
-              <w:top w:w="50" w:type="dxa"/>
-              <w:bottom w:w="50" w:type="dxa"/>
-              <w:left w:w="90" w:type="dxa"/>
-              <w:right w:w="90" w:type="dxa"/>
-            </w:tcMar>
-          </w:tcPr>
-          <w:p>
-            <w:pPr>
-              <w:pStyle w:val="BDOITable"/>
-            </w:pPr>
-            <w:r>
-              <w:rPr>
-                <w:sz w:val="16"/>
-              </w:rPr>
-              <w:t>PM-04, Rate DST (per line, or blank line = every line)</w:t>
-            </w:r>
-          </w:p>
-        </w:tc>
-      </w:tr>
-      <w:tr>
-        <w:tc>
-          <w:tcPr>
-            <w:tcW w:type="dxa" w:w="2040"/>
-            <w:tcMar>
-              <w:top w:w="50" w:type="dxa"/>
-              <w:bottom w:w="50" w:type="dxa"/>
-              <w:left w:w="90" w:type="dxa"/>
-              <w:right w:w="90" w:type="dxa"/>
-            </w:tcMar>
-            <w:shd w:val="clear" w:color="auto" w:fill="E5F5FF"/>
-          </w:tcPr>
-          <w:p>
-            <w:pPr>
-              <w:pStyle w:val="BDOITable"/>
-            </w:pPr>
-            <w:r>
-              <w:rPr>
-                <w:sz w:val="16"/>
-              </w:rPr>
-              <w:t>Premium tax</w:t>
-            </w:r>
-          </w:p>
-        </w:tc>
-        <w:tc>
-          <w:tcPr>
-            <w:tcW w:type="dxa" w:w="5099"/>
-            <w:tcMar>
-              <w:top w:w="50" w:type="dxa"/>
-              <w:bottom w:w="50" w:type="dxa"/>
-              <w:left w:w="90" w:type="dxa"/>
-              <w:right w:w="90" w:type="dxa"/>
-            </w:tcMar>
-            <w:shd w:val="clear" w:color="auto" w:fill="E5F5FF"/>
-          </w:tcPr>
-          <w:p>
-            <w:pPr>
-              <w:pStyle w:val="BDOITable"/>
-            </w:pPr>
-            <w:r>
-              <w:rPr>
-                <w:sz w:val="16"/>
-              </w:rPr>
-              <w:t>Rate % of the net premium of the line, rounded to centavos. BIBS applies it per product line, not by the VAT or non-VAT registration of the insurer.</w:t>
-            </w:r>
-          </w:p>
-        </w:tc>
-        <w:tc>
-          <w:tcPr>
-            <w:tcW w:type="dxa" w:w="2833"/>
-            <w:tcMar>
-              <w:top w:w="50" w:type="dxa"/>
-              <w:bottom w:w="50" w:type="dxa"/>
-              <w:left w:w="90" w:type="dxa"/>
-              <w:right w:w="90" w:type="dxa"/>
-            </w:tcMar>
-            <w:shd w:val="clear" w:color="auto" w:fill="E5F5FF"/>
-          </w:tcPr>
-          <w:p>
-            <w:pPr>
-              <w:pStyle w:val="BDOITable"/>
-            </w:pPr>
-            <w:r>
-              <w:rPr>
-                <w:sz w:val="16"/>
-              </w:rPr>
-              <w:t>PM-04, Rate PREMIUM_TAX (per line)</w:t>
-            </w:r>
-          </w:p>
-        </w:tc>
-      </w:tr>
-      <w:tr>
-        <w:tc>
-          <w:tcPr>
-            <w:tcW w:type="dxa" w:w="2040"/>
-            <w:tcMar>
-              <w:top w:w="50" w:type="dxa"/>
-              <w:bottom w:w="50" w:type="dxa"/>
-              <w:left w:w="90" w:type="dxa"/>
-              <w:right w:w="90" w:type="dxa"/>
-            </w:tcMar>
-          </w:tcPr>
-          <w:p>
-            <w:pPr>
-              <w:pStyle w:val="BDOITable"/>
-            </w:pPr>
-            <w:r>
-              <w:rPr>
-                <w:sz w:val="16"/>
-              </w:rPr>
-              <w:t>VAT on premium</w:t>
-            </w:r>
-          </w:p>
-        </w:tc>
-        <w:tc>
-          <w:tcPr>
-            <w:tcW w:type="dxa" w:w="5099"/>
-            <w:tcMar>
-              <w:top w:w="50" w:type="dxa"/>
-              <w:bottom w:w="50" w:type="dxa"/>
-              <w:left w:w="90" w:type="dxa"/>
-              <w:right w:w="90" w:type="dxa"/>
-            </w:tcMar>
-          </w:tcPr>
-          <w:p>
-            <w:pPr>
-              <w:pStyle w:val="BDOITable"/>
-            </w:pPr>
-            <w:r>
-              <w:rPr>
-                <w:sz w:val="16"/>
-              </w:rPr>
-              <w:t>Rate % of the net premium of the line, rounded to centavos. The charge follows the line; a zero-rated or exempt client is classified on the VAT worksheet by its VAT treatment (TX-01).</w:t>
-            </w:r>
-          </w:p>
-        </w:tc>
-        <w:tc>
-          <w:tcPr>
-            <w:tcW w:type="dxa" w:w="2833"/>
-            <w:tcMar>
-              <w:top w:w="50" w:type="dxa"/>
-              <w:bottom w:w="50" w:type="dxa"/>
-              <w:left w:w="90" w:type="dxa"/>
-              <w:right w:w="90" w:type="dxa"/>
-            </w:tcMar>
-          </w:tcPr>
-          <w:p>
-            <w:pPr>
-              <w:pStyle w:val="BDOITable"/>
-            </w:pPr>
-            <w:r>
-              <w:rPr>
-                <w:sz w:val="16"/>
-              </w:rPr>
-              <w:t>PM-04, Rate VAT_PREMIUM (per line)</w:t>
-            </w:r>
-          </w:p>
-        </w:tc>
-      </w:tr>
-      <w:tr>
-        <w:tc>
-          <w:tcPr>
-            <w:tcW w:type="dxa" w:w="2040"/>
-            <w:tcMar>
-              <w:top w:w="50" w:type="dxa"/>
-              <w:bottom w:w="50" w:type="dxa"/>
-              <w:left w:w="90" w:type="dxa"/>
-              <w:right w:w="90" w:type="dxa"/>
-            </w:tcMar>
-            <w:shd w:val="clear" w:color="auto" w:fill="E5F5FF"/>
-          </w:tcPr>
-          <w:p>
-            <w:pPr>
-              <w:pStyle w:val="BDOITable"/>
-            </w:pPr>
-            <w:r>
-              <w:rPr>
-                <w:sz w:val="16"/>
-              </w:rPr>
-              <w:t>Fire service tax (FST)</w:t>
-            </w:r>
-          </w:p>
-        </w:tc>
-        <w:tc>
-          <w:tcPr>
-            <w:tcW w:type="dxa" w:w="5099"/>
-            <w:tcMar>
-              <w:top w:w="50" w:type="dxa"/>
-              <w:bottom w:w="50" w:type="dxa"/>
-              <w:left w:w="90" w:type="dxa"/>
-              <w:right w:w="90" w:type="dxa"/>
-            </w:tcMar>
-            <w:shd w:val="clear" w:color="auto" w:fill="E5F5FF"/>
-          </w:tcPr>
-          <w:p>
-            <w:pPr>
-              <w:pStyle w:val="BDOITable"/>
-            </w:pPr>
-            <w:r>
-              <w:rPr>
-                <w:sz w:val="16"/>
-              </w:rPr>
-              <w:t>Rate % of the net premium of the lines it is set for, rounded to centavos.</w:t>
-            </w:r>
-          </w:p>
-        </w:tc>
-        <w:tc>
-          <w:tcPr>
-            <w:tcW w:type="dxa" w:w="2833"/>
-            <w:tcMar>
-              <w:top w:w="50" w:type="dxa"/>
-              <w:bottom w:w="50" w:type="dxa"/>
-              <w:left w:w="90" w:type="dxa"/>
-              <w:right w:w="90" w:type="dxa"/>
-            </w:tcMar>
-            <w:shd w:val="clear" w:color="auto" w:fill="E5F5FF"/>
-          </w:tcPr>
-          <w:p>
-            <w:pPr>
-              <w:pStyle w:val="BDOITable"/>
-            </w:pPr>
-            <w:r>
-              <w:rPr>
-                <w:sz w:val="16"/>
-              </w:rPr>
-              <w:t>PM-04, Rate FIRE_SERVICE_TAX (fire lines)</w:t>
-            </w:r>
-          </w:p>
-        </w:tc>
-      </w:tr>
-      <w:tr>
-        <w:tc>
-          <w:tcPr>
-            <w:tcW w:type="dxa" w:w="2040"/>
-            <w:tcMar>
-              <w:top w:w="50" w:type="dxa"/>
-              <w:bottom w:w="50" w:type="dxa"/>
-              <w:left w:w="90" w:type="dxa"/>
-              <w:right w:w="90" w:type="dxa"/>
-            </w:tcMar>
-          </w:tcPr>
-          <w:p>
-            <w:pPr>
-              <w:pStyle w:val="BDOITable"/>
-            </w:pPr>
-            <w:r>
-              <w:rPr>
-                <w:sz w:val="16"/>
-              </w:rPr>
-              <w:t>Local government tax (LGT)</w:t>
-            </w:r>
-          </w:p>
-        </w:tc>
-        <w:tc>
-          <w:tcPr>
-            <w:tcW w:type="dxa" w:w="5099"/>
-            <w:tcMar>
-              <w:top w:w="50" w:type="dxa"/>
-              <w:bottom w:w="50" w:type="dxa"/>
-              <w:left w:w="90" w:type="dxa"/>
-              <w:right w:w="90" w:type="dxa"/>
-            </w:tcMar>
-          </w:tcPr>
-          <w:p>
-            <w:pPr>
-              <w:pStyle w:val="BDOITable"/>
-            </w:pPr>
-            <w:r>
-              <w:rPr>
-                <w:sz w:val="16"/>
-              </w:rPr>
-              <w:t>Rate % of the net premium at the rate of the insurer branch that places the policy, rounded to centavos. BIBS keeps no rate per local government unit.</w:t>
-            </w:r>
-          </w:p>
-        </w:tc>
-        <w:tc>
-          <w:tcPr>
-            <w:tcW w:type="dxa" w:w="2833"/>
-            <w:tcMar>
-              <w:top w:w="50" w:type="dxa"/>
-              <w:bottom w:w="50" w:type="dxa"/>
-              <w:left w:w="90" w:type="dxa"/>
-              <w:right w:w="90" w:type="dxa"/>
-            </w:tcMar>
-          </w:tcPr>
-          <w:p>
-            <w:pPr>
-              <w:pStyle w:val="BDOITable"/>
-            </w:pPr>
-            <w:r>
-              <w:rPr>
-                <w:sz w:val="16"/>
-              </w:rPr>
-              <w:t>R04B, column lgt_rate of each insurer branch</w:t>
-            </w:r>
-          </w:p>
-        </w:tc>
-      </w:tr>
-      <w:tr>
-        <w:tc>
-          <w:tcPr>
-            <w:tcW w:type="dxa" w:w="2040"/>
-            <w:tcMar>
-              <w:top w:w="50" w:type="dxa"/>
-              <w:bottom w:w="50" w:type="dxa"/>
-              <w:left w:w="90" w:type="dxa"/>
-              <w:right w:w="90" w:type="dxa"/>
-            </w:tcMar>
-            <w:shd w:val="clear" w:color="auto" w:fill="E5F5FF"/>
-          </w:tcPr>
-          <w:p>
-            <w:pPr>
-              <w:pStyle w:val="BDOITable"/>
-            </w:pPr>
-            <w:r>
-              <w:rPr>
-                <w:sz w:val="16"/>
-              </w:rPr>
-              <w:t>VAT on BDOI's commission</w:t>
-            </w:r>
-          </w:p>
-        </w:tc>
-        <w:tc>
-          <w:tcPr>
-            <w:tcW w:type="dxa" w:w="5099"/>
-            <w:tcMar>
-              <w:top w:w="50" w:type="dxa"/>
-              <w:bottom w:w="50" w:type="dxa"/>
-              <w:left w:w="90" w:type="dxa"/>
-              <w:right w:w="90" w:type="dxa"/>
-            </w:tcMar>
-            <w:shd w:val="clear" w:color="auto" w:fill="E5F5FF"/>
-          </w:tcPr>
-          <w:p>
-            <w:pPr>
-              <w:pStyle w:val="BDOITable"/>
-            </w:pPr>
-            <w:r>
-              <w:rPr>
-                <w:sz w:val="16"/>
-              </w:rPr>
-              <w:t>Rate % of the commission (commission rate x net premium), rounded to centavos.</w:t>
-            </w:r>
-          </w:p>
-        </w:tc>
-        <w:tc>
-          <w:tcPr>
-            <w:tcW w:type="dxa" w:w="2833"/>
-            <w:tcMar>
-              <w:top w:w="50" w:type="dxa"/>
-              <w:bottom w:w="50" w:type="dxa"/>
-              <w:left w:w="90" w:type="dxa"/>
-              <w:right w:w="90" w:type="dxa"/>
-            </w:tcMar>
-            <w:shd w:val="clear" w:color="auto" w:fill="E5F5FF"/>
-          </w:tcPr>
-          <w:p>
-            <w:pPr>
-              <w:pStyle w:val="BDOITable"/>
-            </w:pPr>
-            <w:r>
-              <w:rPr>
-                <w:sz w:val="16"/>
-              </w:rPr>
-              <w:t>PM-04, Rate VAT_COMMISSION</w:t>
-            </w:r>
-          </w:p>
-        </w:tc>
-      </w:tr>
-      <w:tr>
-        <w:tc>
-          <w:tcPr>
-            <w:tcW w:type="dxa" w:w="2040"/>
-            <w:tcMar>
-              <w:top w:w="50" w:type="dxa"/>
-              <w:bottom w:w="50" w:type="dxa"/>
-              <w:left w:w="90" w:type="dxa"/>
-              <w:right w:w="90" w:type="dxa"/>
-            </w:tcMar>
-          </w:tcPr>
-          <w:p>
-            <w:pPr>
-              <w:pStyle w:val="BDOITable"/>
-            </w:pPr>
-            <w:r>
-              <w:rPr>
-                <w:sz w:val="16"/>
-              </w:rPr>
-              <w:t>Motor own damage / theft coverage factors</w:t>
-            </w:r>
-          </w:p>
-        </w:tc>
-        <w:tc>
-          <w:tcPr>
-            <w:tcW w:type="dxa" w:w="5099"/>
-            <w:tcMar>
-              <w:top w:w="50" w:type="dxa"/>
-              <w:bottom w:w="50" w:type="dxa"/>
-              <w:left w:w="90" w:type="dxa"/>
-              <w:right w:w="90" w:type="dxa"/>
-            </w:tcMar>
-          </w:tcPr>
-          <w:p>
-            <w:pPr>
-              <w:pStyle w:val="BDOITable"/>
-            </w:pPr>
-            <w:r>
-              <w:rPr>
-                <w:sz w:val="16"/>
-              </w:rPr>
-              <w:t>Percent of the sum insured taken as the own damage / theft coverage: one factor for annual cover, one for multi-year cover.</w:t>
-            </w:r>
-          </w:p>
-        </w:tc>
-        <w:tc>
-          <w:tcPr>
-            <w:tcW w:type="dxa" w:w="2833"/>
-            <w:tcMar>
-              <w:top w:w="50" w:type="dxa"/>
-              <w:bottom w:w="50" w:type="dxa"/>
-              <w:left w:w="90" w:type="dxa"/>
-              <w:right w:w="90" w:type="dxa"/>
-            </w:tcMar>
-          </w:tcPr>
-          <w:p>
-            <w:pPr>
-              <w:pStyle w:val="BDOITable"/>
-            </w:pPr>
-            <w:r>
-              <w:rPr>
-                <w:sz w:val="16"/>
-              </w:rPr>
-              <w:t>PM-04, Rates MOTOR_OD_ANNUAL and MOTOR_OD_MULTI_YEAR</w:t>
-            </w:r>
-          </w:p>
-        </w:tc>
-      </w:tr>
-      <w:tr>
-        <w:tc>
-          <w:tcPr>
-            <w:tcW w:type="dxa" w:w="2040"/>
-            <w:tcMar>
-              <w:top w:w="50" w:type="dxa"/>
-              <w:bottom w:w="50" w:type="dxa"/>
-              <w:left w:w="90" w:type="dxa"/>
-              <w:right w:w="90" w:type="dxa"/>
-            </w:tcMar>
-            <w:shd w:val="clear" w:color="auto" w:fill="E5F5FF"/>
-          </w:tcPr>
-          <w:p>
-            <w:pPr>
-              <w:pStyle w:val="BDOITable"/>
-            </w:pPr>
-            <w:r>
-              <w:rPr>
-                <w:sz w:val="16"/>
-              </w:rPr>
-              <w:t>Short-period table and motor BI / PD limit premiums</w:t>
-            </w:r>
-          </w:p>
-        </w:tc>
-        <w:tc>
-          <w:tcPr>
-            <w:tcW w:type="dxa" w:w="5099"/>
-            <w:tcMar>
-              <w:top w:w="50" w:type="dxa"/>
-              <w:bottom w:w="50" w:type="dxa"/>
-              <w:left w:w="90" w:type="dxa"/>
-              <w:right w:w="90" w:type="dxa"/>
-            </w:tcMar>
-            <w:shd w:val="clear" w:color="auto" w:fill="E5F5FF"/>
-          </w:tcPr>
-          <w:p>
-            <w:pPr>
-              <w:pStyle w:val="BDOITable"/>
-            </w:pPr>
-            <w:r>
-              <w:rPr>
-                <w:sz w:val="16"/>
-              </w:rPr>
-              <w:t>Short period: percent of the annual premium by months covered; motor BI / PD: premium per limit.</w:t>
-            </w:r>
-          </w:p>
-        </w:tc>
-        <w:tc>
-          <w:tcPr>
-            <w:tcW w:type="dxa" w:w="2833"/>
-            <w:tcMar>
-              <w:top w:w="50" w:type="dxa"/>
-              <w:bottom w:w="50" w:type="dxa"/>
-              <w:left w:w="90" w:type="dxa"/>
-              <w:right w:w="90" w:type="dxa"/>
-            </w:tcMar>
-            <w:shd w:val="clear" w:color="auto" w:fill="E5F5FF"/>
-          </w:tcPr>
-          <w:p>
-            <w:pPr>
-              <w:pStyle w:val="BDOITable"/>
-            </w:pPr>
-            <w:r>
-              <w:rPr>
-                <w:sz w:val="16"/>
-              </w:rPr>
-              <w:t>PM-04, Tables SHORT_PERIOD and MOTOR_LIMIT</w:t>
-            </w:r>
-          </w:p>
-        </w:tc>
-      </w:tr>
-      <w:tr>
-        <w:tc>
-          <w:tcPr>
-            <w:tcW w:type="dxa" w:w="2040"/>
-            <w:tcMar>
-              <w:top w:w="50" w:type="dxa"/>
-              <w:bottom w:w="50" w:type="dxa"/>
-              <w:left w:w="90" w:type="dxa"/>
-              <w:right w:w="90" w:type="dxa"/>
-            </w:tcMar>
-          </w:tcPr>
-          <w:p>
-            <w:pPr>
-              <w:pStyle w:val="BDOITable"/>
-            </w:pPr>
-            <w:r>
-              <w:rPr>
-                <w:sz w:val="16"/>
-              </w:rPr>
-              <w:t>Order</w:t>
-            </w:r>
-          </w:p>
-        </w:tc>
-        <w:tc>
-          <w:tcPr>
-            <w:tcW w:type="dxa" w:w="5099"/>
-            <w:tcMar>
-              <w:top w:w="50" w:type="dxa"/>
-              <w:bottom w:w="50" w:type="dxa"/>
-              <w:left w:w="90" w:type="dxa"/>
-              <w:right w:w="90" w:type="dxa"/>
-            </w:tcMar>
-          </w:tcPr>
-          <w:p>
-            <w:pPr>
-              <w:pStyle w:val="BDOITable"/>
-            </w:pPr>
-            <w:r>
-              <w:rPr>
-                <w:sz w:val="16"/>
-              </w:rPr>
-              <w:t>basis</w:t>
-            </w:r>
-          </w:p>
-        </w:tc>
-        <w:tc>
-          <w:tcPr>
-            <w:tcW w:type="dxa" w:w="2833"/>
-            <w:tcMar>
-              <w:top w:w="50" w:type="dxa"/>
-              <w:bottom w:w="50" w:type="dxa"/>
-              <w:left w:w="90" w:type="dxa"/>
-              <w:right w:w="90" w:type="dxa"/>
-            </w:tcMar>
-          </w:tcPr>
-          <w:p>
-            <w:pPr>
-              <w:pStyle w:val="BDOITable"/>
-            </w:pPr>
-            <w:r>
-              <w:rPr>
-                <w:sz w:val="16"/>
-              </w:rPr>
-              <w:t>minimum and rounding of the charges</w:t>
-            </w:r>
-          </w:p>
-        </w:tc>
-      </w:tr>
-      <w:tr>
-        <w:tc>
-          <w:tcPr>
-            <w:tcW w:type="dxa" w:w="2040"/>
-            <w:tcMar>
-              <w:top w:w="50" w:type="dxa"/>
-              <w:bottom w:w="50" w:type="dxa"/>
-              <w:left w:w="90" w:type="dxa"/>
-              <w:right w:w="90" w:type="dxa"/>
-            </w:tcMar>
-            <w:shd w:val="clear" w:color="auto" w:fill="E5F5FF"/>
-          </w:tcPr>
-          <w:p>
-            <w:pPr>
-              <w:pStyle w:val="BDOITable"/>
-            </w:pPr>
-            <w:r>
-              <w:rPr>
-                <w:sz w:val="16"/>
-              </w:rPr>
-              <w:t>CTPL COCAF / LTO authentication fee</w:t>
-            </w:r>
-          </w:p>
-        </w:tc>
-        <w:tc>
-          <w:tcPr>
-            <w:tcW w:type="dxa" w:w="5099"/>
-            <w:tcMar>
-              <w:top w:w="50" w:type="dxa"/>
-              <w:bottom w:w="50" w:type="dxa"/>
-              <w:left w:w="90" w:type="dxa"/>
-              <w:right w:w="90" w:type="dxa"/>
-            </w:tcMar>
-            <w:shd w:val="clear" w:color="auto" w:fill="E5F5FF"/>
-          </w:tcPr>
-          <w:p>
-            <w:pPr>
-              <w:pStyle w:val="BDOITable"/>
-            </w:pPr>
-            <w:r>
-              <w:rPr>
-                <w:sz w:val="16"/>
-              </w:rPr>
-              <w:t>No field: BIBS has no charge other than the taxes above.</w:t>
-            </w:r>
-          </w:p>
-        </w:tc>
-        <w:tc>
-          <w:tcPr>
-            <w:tcW w:type="dxa" w:w="2833"/>
-            <w:tcMar>
-              <w:top w:w="50" w:type="dxa"/>
-              <w:bottom w:w="50" w:type="dxa"/>
-              <w:left w:w="90" w:type="dxa"/>
-              <w:right w:w="90" w:type="dxa"/>
-            </w:tcMar>
-            <w:shd w:val="clear" w:color="auto" w:fill="E5F5FF"/>
-          </w:tcPr>
-          <w:p>
-            <w:pPr>
-              <w:pStyle w:val="BDOITable"/>
-            </w:pPr>
-            <w:r>
-              <w:rPr>
-                <w:sz w:val="16"/>
-              </w:rPr>
-              <w:t>Not held (sheet Gaps)</w:t>
-            </w:r>
-          </w:p>
-        </w:tc>
-      </w:tr>
-      <w:tr>
-        <w:tc>
-          <w:tcPr>
-            <w:tcW w:type="dxa" w:w="2040"/>
-            <w:tcMar>
-              <w:top w:w="50" w:type="dxa"/>
-              <w:bottom w:w="50" w:type="dxa"/>
-              <w:left w:w="90" w:type="dxa"/>
-              <w:right w:w="90" w:type="dxa"/>
-            </w:tcMar>
-          </w:tcPr>
-          <w:p>
-            <w:pPr>
-              <w:pStyle w:val="BDOITable"/>
-            </w:pPr>
-            <w:r>
-              <w:rPr>
-                <w:sz w:val="16"/>
-              </w:rPr>
-              <w:t>Notarial fee</w:t>
-            </w:r>
-          </w:p>
-        </w:tc>
-        <w:tc>
-          <w:tcPr>
-            <w:tcW w:type="dxa" w:w="5099"/>
-            <w:tcMar>
-              <w:top w:w="50" w:type="dxa"/>
-              <w:bottom w:w="50" w:type="dxa"/>
-              <w:left w:w="90" w:type="dxa"/>
-              <w:right w:w="90" w:type="dxa"/>
-            </w:tcMar>
-          </w:tcPr>
-          <w:p>
-            <w:pPr>
-              <w:pStyle w:val="BDOITable"/>
-            </w:pPr>
-            <w:r>
-              <w:rPr>
-                <w:sz w:val="16"/>
-              </w:rPr>
-              <w:t>No field.</w:t>
-            </w:r>
-          </w:p>
-        </w:tc>
-        <w:tc>
-          <w:tcPr>
-            <w:tcW w:type="dxa" w:w="2833"/>
-            <w:tcMar>
-              <w:top w:w="50" w:type="dxa"/>
-              <w:bottom w:w="50" w:type="dxa"/>
-              <w:left w:w="90" w:type="dxa"/>
-              <w:right w:w="90" w:type="dxa"/>
-            </w:tcMar>
-          </w:tcPr>
-          <w:p>
-            <w:pPr>
-              <w:pStyle w:val="BDOITable"/>
-            </w:pPr>
-            <w:r>
-              <w:rPr>
-                <w:sz w:val="16"/>
-              </w:rPr>
-              <w:t>Not held (sheet Gaps)</w:t>
-            </w:r>
-          </w:p>
-        </w:tc>
-      </w:tr>
-      <w:tr>
-        <w:tc>
-          <w:tcPr>
-            <w:tcW w:type="dxa" w:w="2040"/>
-            <w:tcMar>
-              <w:top w:w="50" w:type="dxa"/>
-              <w:bottom w:w="50" w:type="dxa"/>
-              <w:left w:w="90" w:type="dxa"/>
-              <w:right w:w="90" w:type="dxa"/>
-            </w:tcMar>
-            <w:shd w:val="clear" w:color="auto" w:fill="E5F5FF"/>
-          </w:tcPr>
-          <w:p>
-            <w:pPr>
-              <w:pStyle w:val="BDOITable"/>
-            </w:pPr>
-            <w:r>
-              <w:rPr>
-                <w:sz w:val="16"/>
-              </w:rPr>
-              <w:t>Policy or documentation fee</w:t>
-            </w:r>
-          </w:p>
-        </w:tc>
-        <w:tc>
-          <w:tcPr>
-            <w:tcW w:type="dxa" w:w="5099"/>
-            <w:tcMar>
-              <w:top w:w="50" w:type="dxa"/>
-              <w:bottom w:w="50" w:type="dxa"/>
-              <w:left w:w="90" w:type="dxa"/>
-              <w:right w:w="90" w:type="dxa"/>
-            </w:tcMar>
-            <w:shd w:val="clear" w:color="auto" w:fill="E5F5FF"/>
-          </w:tcPr>
-          <w:p>
-            <w:pPr>
-              <w:pStyle w:val="BDOITable"/>
-            </w:pPr>
-            <w:r>
-              <w:rPr>
-                <w:sz w:val="16"/>
-              </w:rPr>
-              <w:t>No field.</w:t>
-            </w:r>
-          </w:p>
-        </w:tc>
-        <w:tc>
-          <w:tcPr>
-            <w:tcW w:type="dxa" w:w="2833"/>
-            <w:tcMar>
-              <w:top w:w="50" w:type="dxa"/>
-              <w:bottom w:w="50" w:type="dxa"/>
-              <w:left w:w="90" w:type="dxa"/>
-              <w:right w:w="90" w:type="dxa"/>
-            </w:tcMar>
-            <w:shd w:val="clear" w:color="auto" w:fill="E5F5FF"/>
-          </w:tcPr>
-          <w:p>
-            <w:pPr>
-              <w:pStyle w:val="BDOITable"/>
-            </w:pPr>
-            <w:r>
-              <w:rPr>
-                <w:sz w:val="16"/>
-              </w:rPr>
-              <w:t>Not held (sheet Gaps)</w:t>
-            </w:r>
-          </w:p>
-        </w:tc>
-      </w:tr>
-      <w:tr>
-        <w:tc>
-          <w:tcPr>
-            <w:tcW w:type="dxa" w:w="2040"/>
-            <w:tcMar>
-              <w:top w:w="50" w:type="dxa"/>
-              <w:bottom w:w="50" w:type="dxa"/>
-              <w:left w:w="90" w:type="dxa"/>
-              <w:right w:w="90" w:type="dxa"/>
-            </w:tcMar>
-          </w:tcPr>
-          <w:p>
-            <w:pPr>
-              <w:pStyle w:val="BDOITable"/>
-            </w:pPr>
-            <w:r>
-              <w:rPr>
-                <w:sz w:val="16"/>
-              </w:rPr>
-              <w:t>Any other charge BDOI bills</w:t>
-            </w:r>
-          </w:p>
-        </w:tc>
-        <w:tc>
-          <w:tcPr>
-            <w:tcW w:type="dxa" w:w="5099"/>
-            <w:tcMar>
-              <w:top w:w="50" w:type="dxa"/>
-              <w:bottom w:w="50" w:type="dxa"/>
-              <w:left w:w="90" w:type="dxa"/>
-              <w:right w:w="90" w:type="dxa"/>
-            </w:tcMar>
-          </w:tcPr>
-          <w:p>
-            <w:pPr>
-              <w:pStyle w:val="BDOITable"/>
-            </w:pPr>
-            <w:r>
-              <w:rPr>
-                <w:sz w:val="16"/>
-              </w:rPr>
-              <w:t>No field.</w:t>
-            </w:r>
-          </w:p>
-        </w:tc>
-        <w:tc>
-          <w:tcPr>
-            <w:tcW w:type="dxa" w:w="2833"/>
-            <w:tcMar>
-              <w:top w:w="50" w:type="dxa"/>
-              <w:bottom w:w="50" w:type="dxa"/>
-              <w:left w:w="90" w:type="dxa"/>
-              <w:right w:w="90" w:type="dxa"/>
-            </w:tcMar>
-          </w:tcPr>
-          <w:p>
-            <w:pPr>
-              <w:pStyle w:val="BDOITable"/>
-            </w:pPr>
-            <w:r>
-              <w:rPr>
-                <w:sz w:val="16"/>
-              </w:rPr>
-              <w:t>Not held (sheet Gaps)</w:t>
-            </w:r>
-          </w:p>
-        </w:tc>
-      </w:tr>
-    </w:tbl>
-    <w:p>
-      <w:pPr>
-        <w:pStyle w:val="BDOISpacer"/>
-      </w:pPr>
     </w:p>
     <w:p>
       <w:r>
@@ -5352,7 +4322,7 @@
           <w:b/>
           <w:i w:val="0"/>
         </w:rPr>
-        <w:t xml:space="preserve">Table 3: </w:t>
+        <w:t xml:space="preserve">Table 2: </w:t>
       </w:r>
       <w:r>
         <w:rPr/>
@@ -5722,7 +4692,7 @@
           <w:b/>
           <w:i w:val="0"/>
         </w:rPr>
-        <w:t xml:space="preserve">Table 4: </w:t>
+        <w:t xml:space="preserve">Table 3: </w:t>
       </w:r>
       <w:r>
         <w:rPr/>
@@ -6703,7 +5673,7 @@
           <w:b/>
           <w:i w:val="0"/>
         </w:rPr>
-        <w:t xml:space="preserve">Table 5: </w:t>
+        <w:t xml:space="preserve">Table 4: </w:t>
       </w:r>
       <w:r>
         <w:rPr/>
@@ -6980,7 +5950,7 @@
               <w:rPr>
                 <w:sz w:val="15"/>
               </w:rPr>
-              <w:t>Configuration screen – upload on the screen (being added; until then BDOI fills this template and it is loaded on the screen with maker-checker)</w:t>
+              <w:t>Configuration screen</w:t>
             </w:r>
           </w:p>
         </w:tc>
@@ -7118,7 +6088,7 @@
               <w:rPr>
                 <w:sz w:val="15"/>
               </w:rPr>
-              <w:t>Configuration screen – upload on the screen (being added; until then BDOI fills this template and it is loaded on the screen with maker-checker)</w:t>
+              <w:t>Configuration screen</w:t>
             </w:r>
           </w:p>
         </w:tc>
@@ -7254,7 +6224,7 @@
               <w:rPr>
                 <w:sz w:val="15"/>
               </w:rPr>
-              <w:t>Configuration screen – upload on the screen (being added; until then BDOI fills this template and it is loaded on the screen with maker-checker)</w:t>
+              <w:t>Configuration screen</w:t>
             </w:r>
           </w:p>
         </w:tc>
@@ -7392,7 +6362,7 @@
               <w:rPr>
                 <w:sz w:val="15"/>
               </w:rPr>
-              <w:t>Configuration screen – upload on the screen (being added; until then BDOI fills this template and it is loaded on the screen with maker-checker)</w:t>
+              <w:t>Configuration screen</w:t>
             </w:r>
           </w:p>
         </w:tc>
@@ -7528,7 +6498,7 @@
               <w:rPr>
                 <w:sz w:val="15"/>
               </w:rPr>
-              <w:t>Configuration screen – upload on the screen (being added; until then BDOI fills this template and it is loaded on the screen with maker-checker)</w:t>
+              <w:t>Configuration screen</w:t>
             </w:r>
           </w:p>
         </w:tc>
@@ -7940,7 +6910,7 @@
               <w:rPr>
                 <w:sz w:val="15"/>
               </w:rPr>
-              <w:t>Configuration screen – upload on the screen (being added; until then BDOI fills this template and it is loaded on the screen with maker-checker)</w:t>
+              <w:t>Configuration screen</w:t>
             </w:r>
           </w:p>
         </w:tc>
@@ -8076,7 +7046,7 @@
               <w:rPr>
                 <w:sz w:val="15"/>
               </w:rPr>
-              <w:t>Configuration screen – upload on the screen (being added; until then BDOI fills this template and it is loaded on the screen with maker-checker)</w:t>
+              <w:t>Configuration screen</w:t>
             </w:r>
           </w:p>
         </w:tc>
@@ -8214,7 +7184,7 @@
               <w:rPr>
                 <w:sz w:val="15"/>
               </w:rPr>
-              <w:t>Configuration screen – upload on the screen (being added; until then BDOI fills this template and it is loaded on the screen with maker-checker)</w:t>
+              <w:t>Configuration screen</w:t>
             </w:r>
           </w:p>
         </w:tc>
@@ -8488,7 +7458,7 @@
               <w:rPr>
                 <w:sz w:val="15"/>
               </w:rPr>
-              <w:t>Configuration screen – upload on the screen (being added; until then BDOI fills this template and it is loaded on the screen with maker-checker)</w:t>
+              <w:t>Configuration screen</w:t>
             </w:r>
           </w:p>
         </w:tc>
@@ -9036,7 +8006,7 @@
               <w:rPr>
                 <w:sz w:val="15"/>
               </w:rPr>
-              <w:t>Configuration screen – upload on the screen (being added; until then BDOI fills this template and it is loaded on the screen with maker-checker)</w:t>
+              <w:t>Configuration screen</w:t>
             </w:r>
           </w:p>
         </w:tc>
@@ -9172,7 +8142,7 @@
               <w:rPr>
                 <w:sz w:val="15"/>
               </w:rPr>
-              <w:t>Configuration screen – upload on the screen (being added; until then BDOI fills this template and it is loaded on the screen with maker-checker)</w:t>
+              <w:t>Configuration screen</w:t>
             </w:r>
           </w:p>
         </w:tc>
@@ -9720,7 +8690,7 @@
               <w:rPr>
                 <w:sz w:val="15"/>
               </w:rPr>
-              <w:t>Configuration screen – upload on the screen (being added; until then BDOI fills this template and it is loaded on the screen with maker-checker)</w:t>
+              <w:t>Configuration screen</w:t>
             </w:r>
           </w:p>
         </w:tc>
@@ -10132,7 +9102,7 @@
               <w:rPr>
                 <w:sz w:val="15"/>
               </w:rPr>
-              <w:t>Configuration screen – upload on the screen (being added; until then BDOI fills this template and it is loaded on the screen with maker-checker)</w:t>
+              <w:t>Configuration screen</w:t>
             </w:r>
           </w:p>
         </w:tc>
@@ -10268,7 +9238,7 @@
               <w:rPr>
                 <w:sz w:val="15"/>
               </w:rPr>
-              <w:t>Configuration screen – upload on the screen (being added; until then BDOI fills this template and it is loaded on the screen with maker-checker)</w:t>
+              <w:t>Configuration screen</w:t>
             </w:r>
           </w:p>
         </w:tc>
@@ -10816,7 +9786,7 @@
               <w:rPr>
                 <w:sz w:val="15"/>
               </w:rPr>
-              <w:t>Configuration screen – upload on the screen (being added; until then BDOI fills this template and it is loaded on the screen with maker-checker)</w:t>
+              <w:t>Configuration screen</w:t>
             </w:r>
           </w:p>
         </w:tc>
@@ -10954,7 +9924,7 @@
               <w:rPr>
                 <w:sz w:val="15"/>
               </w:rPr>
-              <w:t>Configuration screen – upload on the screen (being added; until then BDOI fills this template and it is loaded on the screen with maker-checker)</w:t>
+              <w:t>Configuration screen</w:t>
             </w:r>
           </w:p>
         </w:tc>
@@ -11090,7 +10060,7 @@
               <w:rPr>
                 <w:sz w:val="15"/>
               </w:rPr>
-              <w:t>Configuration screen – upload on the screen (being added; until then BDOI fills this template and it is loaded on the screen with maker-checker)</w:t>
+              <w:t>Configuration screen</w:t>
             </w:r>
           </w:p>
         </w:tc>
@@ -11228,7 +10198,7 @@
               <w:rPr>
                 <w:sz w:val="15"/>
               </w:rPr>
-              <w:t>Configuration screen – upload on the screen (being added; until then BDOI fills this template and it is loaded on the screen with maker-checker)</w:t>
+              <w:t>Configuration screen</w:t>
             </w:r>
           </w:p>
         </w:tc>
@@ -11502,7 +10472,7 @@
               <w:rPr>
                 <w:sz w:val="15"/>
               </w:rPr>
-              <w:t>Configuration screen – upload on the screen (being added; until then BDOI fills this template and it is loaded on the screen with maker-checker)</w:t>
+              <w:t>Configuration screen</w:t>
             </w:r>
           </w:p>
         </w:tc>
@@ -11638,7 +10608,7 @@
               <w:rPr>
                 <w:sz w:val="15"/>
               </w:rPr>
-              <w:t>Configuration screen – upload on the screen (being added; until then BDOI fills this template and it is loaded on the screen with maker-checker)</w:t>
+              <w:t>Configuration screen</w:t>
             </w:r>
           </w:p>
         </w:tc>
@@ -11776,7 +10746,7 @@
               <w:rPr>
                 <w:sz w:val="15"/>
               </w:rPr>
-              <w:t>Configuration screen – upload on the screen (being added; until then BDOI fills this template and it is loaded on the screen with maker-checker)</w:t>
+              <w:t>Configuration screen</w:t>
             </w:r>
           </w:p>
         </w:tc>
@@ -11912,7 +10882,7 @@
               <w:rPr>
                 <w:sz w:val="15"/>
               </w:rPr>
-              <w:t>Configuration screen – upload on the screen (being added; until then BDOI fills this template and it is loaded on the screen with maker-checker)</w:t>
+              <w:t>Configuration screen</w:t>
             </w:r>
           </w:p>
         </w:tc>
@@ -12324,7 +11294,7 @@
               <w:rPr>
                 <w:sz w:val="15"/>
               </w:rPr>
-              <w:t>Configuration screen – upload on the screen (being added; until then BDOI fills this template and it is loaded on the screen with maker-checker)</w:t>
+              <w:t>Configuration screen</w:t>
             </w:r>
           </w:p>
         </w:tc>
@@ -12460,7 +11430,7 @@
               <w:rPr>
                 <w:sz w:val="15"/>
               </w:rPr>
-              <w:t>Configuration screen – upload on the screen (being added; until then BDOI fills this template and it is loaded on the screen with maker-checker)</w:t>
+              <w:t>Configuration screen</w:t>
             </w:r>
           </w:p>
         </w:tc>
@@ -12598,7 +11568,7 @@
               <w:rPr>
                 <w:sz w:val="15"/>
               </w:rPr>
-              <w:t>Configuration screen – upload on the screen (being added; until then BDOI fills this template and it is loaded on the screen with maker-checker)</w:t>
+              <w:t>Configuration screen</w:t>
             </w:r>
           </w:p>
         </w:tc>
@@ -12872,7 +11842,7 @@
               <w:rPr>
                 <w:sz w:val="15"/>
               </w:rPr>
-              <w:t>Configuration screen – upload on the screen (being added; until then BDOI fills this template and it is loaded on the screen with maker-checker)</w:t>
+              <w:t>Configuration screen</w:t>
             </w:r>
           </w:p>
         </w:tc>
@@ -13008,7 +11978,7 @@
               <w:rPr>
                 <w:sz w:val="15"/>
               </w:rPr>
-              <w:t>Configuration screen – upload on the screen (being added; until then BDOI fills this template and it is loaded on the screen with maker-checker)</w:t>
+              <w:t>Configuration screen</w:t>
             </w:r>
           </w:p>
         </w:tc>
@@ -13146,7 +12116,7 @@
               <w:rPr>
                 <w:sz w:val="15"/>
               </w:rPr>
-              <w:t>Configuration screen – upload on the screen (being added; until then BDOI fills this template and it is loaded on the screen with maker-checker)</w:t>
+              <w:t>Configuration screen</w:t>
             </w:r>
           </w:p>
         </w:tc>
@@ -13282,7 +12252,7 @@
               <w:rPr>
                 <w:sz w:val="15"/>
               </w:rPr>
-              <w:t>Configuration screen – upload on the screen (being added; until then BDOI fills this template and it is loaded on the screen with maker-checker)</w:t>
+              <w:t>Configuration screen</w:t>
             </w:r>
           </w:p>
         </w:tc>
@@ -13556,7 +12526,7 @@
               <w:rPr>
                 <w:sz w:val="15"/>
               </w:rPr>
-              <w:t>Configuration screen – upload on the screen (being added; until then BDOI fills this template and it is loaded on the screen with maker-checker)</w:t>
+              <w:t>Configuration screen</w:t>
             </w:r>
           </w:p>
         </w:tc>
@@ -13694,7 +12664,7 @@
               <w:rPr>
                 <w:sz w:val="15"/>
               </w:rPr>
-              <w:t>Configuration screen – upload on the screen (being added; until then BDOI fills this template and it is loaded on the screen with maker-checker)</w:t>
+              <w:t>Configuration screen</w:t>
             </w:r>
           </w:p>
         </w:tc>
@@ -14368,7 +13338,7 @@
           <w:b/>
           <w:i w:val="0"/>
         </w:rPr>
-        <w:t xml:space="preserve">Table 6: </w:t>
+        <w:t xml:space="preserve">Table 5: </w:t>
       </w:r>
       <w:r>
         <w:rPr/>
@@ -16655,7 +15625,7 @@
           <w:b/>
           <w:i w:val="0"/>
         </w:rPr>
-        <w:t xml:space="preserve">Table 7: </w:t>
+        <w:t xml:space="preserve">Table 6: </w:t>
       </w:r>
       <w:r>
         <w:rPr/>
@@ -18013,145 +16983,6 @@
                 <w:sz w:val="16"/>
               </w:rPr>
               <w:t>No contact persons per insurer Question MD-Q08 of the BDOI Requirements and Inputs workbook.</w:t>
-            </w:r>
-          </w:p>
-        </w:tc>
-      </w:tr>
-      <w:tr>
-        <w:tc>
-          <w:tcPr>
-            <w:tcW w:type="dxa" w:w="907"/>
-            <w:tcMar>
-              <w:top w:w="50" w:type="dxa"/>
-              <w:bottom w:w="50" w:type="dxa"/>
-              <w:left w:w="90" w:type="dxa"/>
-              <w:right w:w="90" w:type="dxa"/>
-            </w:tcMar>
-          </w:tcPr>
-          <w:p>
-            <w:pPr>
-              <w:pStyle w:val="BDOITable"/>
-            </w:pPr>
-            <w:r>
-              <w:rPr>
-                <w:sz w:val="16"/>
-              </w:rPr>
-              <w:t>TX-Q04</w:t>
-            </w:r>
-          </w:p>
-        </w:tc>
-        <w:tc>
-          <w:tcPr>
-            <w:tcW w:type="dxa" w:w="2833"/>
-            <w:tcMar>
-              <w:top w:w="50" w:type="dxa"/>
-              <w:bottom w:w="50" w:type="dxa"/>
-              <w:left w:w="90" w:type="dxa"/>
-              <w:right w:w="90" w:type="dxa"/>
-            </w:tcMar>
-          </w:tcPr>
-          <w:p>
-            <w:pPr>
-              <w:pStyle w:val="BDOITable"/>
-            </w:pPr>
-            <w:r>
-              <w:rPr>
-                <w:sz w:val="16"/>
-              </w:rPr>
-              <w:t>Premium charges (DST, premium tax, VAT, FST, LGT, VAT on commission) and other charges</w:t>
-            </w:r>
-          </w:p>
-        </w:tc>
-        <w:tc>
-          <w:tcPr>
-            <w:tcW w:type="dxa" w:w="6232"/>
-            <w:tcMar>
-              <w:top w:w="50" w:type="dxa"/>
-              <w:bottom w:w="50" w:type="dxa"/>
-              <w:left w:w="90" w:type="dxa"/>
-              <w:right w:w="90" w:type="dxa"/>
-            </w:tcMar>
-          </w:tcPr>
-          <w:p>
-            <w:pPr>
-              <w:pStyle w:val="BDOITable"/>
-            </w:pPr>
-            <w:r>
-              <w:rPr>
-                <w:sz w:val="16"/>
-              </w:rPr>
-              <w:t>Other charges (COCAF / LTO authentication, notarial, documentation fees) have no field Question TX-Q04 of the BDOI Requirements and Inputs workbook.</w:t>
-            </w:r>
-          </w:p>
-        </w:tc>
-      </w:tr>
-      <w:tr>
-        <w:tc>
-          <w:tcPr>
-            <w:tcW w:type="dxa" w:w="907"/>
-            <w:tcMar>
-              <w:top w:w="50" w:type="dxa"/>
-              <w:bottom w:w="50" w:type="dxa"/>
-              <w:left w:w="90" w:type="dxa"/>
-              <w:right w:w="90" w:type="dxa"/>
-            </w:tcMar>
-            <w:shd w:val="clear" w:color="auto" w:fill="E5F5FF"/>
-          </w:tcPr>
-          <w:p>
-            <w:pPr>
-              <w:pStyle w:val="BDOITable"/>
-            </w:pPr>
-            <w:r>
-              <w:rPr>
-                <w:sz w:val="16"/>
-              </w:rPr>
-              <w:t>TX-Q06</w:t>
-            </w:r>
-          </w:p>
-        </w:tc>
-        <w:tc>
-          <w:tcPr>
-            <w:tcW w:type="dxa" w:w="2833"/>
-            <w:tcMar>
-              <w:top w:w="50" w:type="dxa"/>
-              <w:bottom w:w="50" w:type="dxa"/>
-              <w:left w:w="90" w:type="dxa"/>
-              <w:right w:w="90" w:type="dxa"/>
-            </w:tcMar>
-            <w:shd w:val="clear" w:color="auto" w:fill="E5F5FF"/>
-          </w:tcPr>
-          <w:p>
-            <w:pPr>
-              <w:pStyle w:val="BDOITable"/>
-            </w:pPr>
-            <w:r>
-              <w:rPr>
-                <w:sz w:val="16"/>
-              </w:rPr>
-              <w:t>BDOI's own taxes, tax profiles and tax forms</w:t>
-            </w:r>
-          </w:p>
-        </w:tc>
-        <w:tc>
-          <w:tcPr>
-            <w:tcW w:type="dxa" w:w="6232"/>
-            <w:tcMar>
-              <w:top w:w="50" w:type="dxa"/>
-              <w:bottom w:w="50" w:type="dxa"/>
-              <w:left w:w="90" w:type="dxa"/>
-              <w:right w:w="90" w:type="dxa"/>
-            </w:tcMar>
-            <w:shd w:val="clear" w:color="auto" w:fill="E5F5FF"/>
-          </w:tcPr>
-          <w:p>
-            <w:pPr>
-              <w:pStyle w:val="BDOITable"/>
-            </w:pPr>
-            <w:r>
-              <w:rPr>
-                <w:sz w:val="16"/>
-              </w:rPr>
-              <w:t>No final tax type, no government / top withholding agent flags, no exemption certificates Question TX-Q06 of the BDOI Requirements and Inputs workbook.</w:t>
             </w:r>
           </w:p>
         </w:tc>

</xml_diff>